<commit_message>
docs: Combine Documentations/Maintenance pass
12 bullets covering: branch retarget, real test/audit data,
security/triage/traceability judgment pass, dead Docker/nginx doc
removal, AutoTest Results rename+fix, setup/ folder move+review,
deploy-review.mjs/.yml renames, Application Workflow 5-diagram
accuracy fix, SmartRPD_Documentation.docx function-name audit,
SmartRPD diagram accuracy fix + full PlantUML/Mermaid source folder,
UAT TSK-031/032 fix, new Handover_Document.docx, new
MASTER_DOCUMENT.docx.

Non-Documentations files included, flagged explicitly:
.github/workflows/deploy.yml, .github/workflows/deploy-review.yml
(renamed from weekly-doc-review.yml), tools/deploy-review.mjs
(renamed from weekly-doc-review.mjs), .gitignore

The "Save Before Exit" prompt for 2D Annotation (src/js/2D/2DAnnotation.js)
remains stashed and is not part of this commit.

Co-Authored-By: Claude Sonnet 5 <noreply@anthropic.com>
</commit_message>
<xml_diff>
--- a/Documentations/Automated_Test_Suite_Report.docx
+++ b/Documentations/Automated_Test_Suite_Report.docx
@@ -6,12 +6,21 @@
       <w:pPr>
         <w:spacing w:after="40"/>
       </w:pPr>
+      <w:proofErr w:type="spellStart"/>
       <w:r>
         <w:rPr>
           <w:b/>
           <w:sz w:val="40"/>
         </w:rPr>
-        <w:t>SmartRPD Web Application</w:t>
+        <w:t>SmartRPD</w:t>
+      </w:r>
+      <w:proofErr w:type="spellEnd"/>
+      <w:r>
+        <w:rPr>
+          <w:b/>
+          <w:sz w:val="40"/>
+        </w:rPr>
+        <w:t xml:space="preserve"> Web Application</w:t>
       </w:r>
     </w:p>
     <w:p>
@@ -35,7 +44,23 @@
           <w:i/>
           <w:sz w:val="22"/>
         </w:rPr>
-        <w:t>Full Jest suite, per-test results and coverage — nyunt/dev-W7.1 (live)</w:t>
+        <w:t xml:space="preserve">Full Jest suite, per-test results and coverage — </w:t>
+      </w:r>
+      <w:proofErr w:type="spellStart"/>
+      <w:r>
+        <w:rPr>
+          <w:i/>
+          <w:sz w:val="22"/>
+        </w:rPr>
+        <w:t>nyunt</w:t>
+      </w:r>
+      <w:proofErr w:type="spellEnd"/>
+      <w:r>
+        <w:rPr>
+          <w:i/>
+          <w:sz w:val="22"/>
+        </w:rPr>
+        <w:t>/dev-W7.1 (live)</w:t>
       </w:r>
     </w:p>
     <w:p>
@@ -48,7 +73,21 @@
     </w:p>
     <w:p>
       <w:r>
-        <w:t>This report captures the complete, currently-passing automated test suite as run directly against nyunt/dev-W7.1, the live deployed branch (built from dev-deploy-documentation). It expands on the one-line automated-gate summary with the full per-suite, per-test breakdown and coverage detail, for reference.</w:t>
+        <w:t xml:space="preserve">This report captures the complete, </w:t>
+      </w:r>
+      <w:r>
+        <w:t>currently passing</w:t>
+      </w:r>
+      <w:r>
+        <w:t xml:space="preserve"> automated test suite as run directly against </w:t>
+      </w:r>
+      <w:proofErr w:type="spellStart"/>
+      <w:r>
+        <w:t>nyunt</w:t>
+      </w:r>
+      <w:proofErr w:type="spellEnd"/>
+      <w:r>
+        <w:t>/dev-W7.1, the live deployed branch. It expands on the one-line automated-gate summary with the full per-suite, per-test breakdown and coverage detail, for reference.</w:t>
       </w:r>
     </w:p>
     <w:p>
@@ -61,7 +100,87 @@
     </w:p>
     <w:p>
       <w:r>
-        <w:t>The command run is the same test:ci script the “Deploy Test Site” GitHub Actions workflow runs as a fail-closed gate before every deploy (.github/workflows/deploy.yml). This branch does not carry the tools/run-uat-automated-tests.mjs wrapper script present on some other branches, so this run was invoked directly: npx jest --ci --coverage --coverageReporters=json-summary --verbose --testLocationInResults --json.</w:t>
+        <w:t xml:space="preserve">The command run is the same </w:t>
+      </w:r>
+      <w:proofErr w:type="spellStart"/>
+      <w:r>
+        <w:t>test:ci</w:t>
+      </w:r>
+      <w:proofErr w:type="spellEnd"/>
+      <w:r>
+        <w:t xml:space="preserve"> script the “Deploy Test Site” GitHub Actions workflow runs as a fail-closed gate before every deploy (.</w:t>
+      </w:r>
+      <w:proofErr w:type="spellStart"/>
+      <w:r>
+        <w:t>github</w:t>
+      </w:r>
+      <w:proofErr w:type="spellEnd"/>
+      <w:r>
+        <w:t>/workflows/</w:t>
+      </w:r>
+      <w:proofErr w:type="spellStart"/>
+      <w:r>
+        <w:t>deploy.yml</w:t>
+      </w:r>
+      <w:proofErr w:type="spellEnd"/>
+      <w:r>
+        <w:t>). This branch does not carry the tools/run-</w:t>
+      </w:r>
+      <w:proofErr w:type="spellStart"/>
+      <w:r>
+        <w:t>uat</w:t>
+      </w:r>
+      <w:proofErr w:type="spellEnd"/>
+      <w:r>
+        <w:t>-automated-</w:t>
+      </w:r>
+      <w:proofErr w:type="spellStart"/>
+      <w:r>
+        <w:t>tests.mjs</w:t>
+      </w:r>
+      <w:proofErr w:type="spellEnd"/>
+      <w:r>
+        <w:t xml:space="preserve"> wrapper script present on some other branches, so this run was invoked directly: </w:t>
+      </w:r>
+      <w:proofErr w:type="spellStart"/>
+      <w:r>
+        <w:t>npx</w:t>
+      </w:r>
+      <w:proofErr w:type="spellEnd"/>
+      <w:r>
+        <w:t xml:space="preserve"> jest --ci --coverage --</w:t>
+      </w:r>
+      <w:proofErr w:type="spellStart"/>
+      <w:r>
+        <w:t>coverageReporters</w:t>
+      </w:r>
+      <w:proofErr w:type="spellEnd"/>
+      <w:r>
+        <w:t>=</w:t>
+      </w:r>
+      <w:proofErr w:type="spellStart"/>
+      <w:r>
+        <w:t>json</w:t>
+      </w:r>
+      <w:proofErr w:type="spellEnd"/>
+      <w:r>
+        <w:t>-summary --verbose --</w:t>
+      </w:r>
+      <w:proofErr w:type="spellStart"/>
+      <w:r>
+        <w:t>testLocationInResults</w:t>
+      </w:r>
+      <w:proofErr w:type="spellEnd"/>
+      <w:r>
+        <w:t xml:space="preserve"> --</w:t>
+      </w:r>
+      <w:proofErr w:type="spellStart"/>
+      <w:r>
+        <w:t>json</w:t>
+      </w:r>
+      <w:proofErr w:type="spellEnd"/>
+      <w:r>
+        <w:t>.</w:t>
       </w:r>
     </w:p>
     <w:p>
@@ -133,11 +252,13 @@
             <w:tcW w:w="6192" w:type="dxa"/>
           </w:tcPr>
           <w:p>
-            <w:r>
-              <w:rPr>
-                <w:sz w:val="19"/>
-              </w:rPr>
-              <w:t>nyunt/dev-W7.1 (live) — built from dev-deploy-documentation @ e621194 — “feat(help-bot): Add reveal controls to open containers before highlighting” (2026-07-28 15:00:25 +0800)</w:t>
+            <w:proofErr w:type="spellStart"/>
+            <w:r>
+              <w:t>nyunt</w:t>
+            </w:r>
+            <w:proofErr w:type="spellEnd"/>
+            <w:r>
+              <w:t>/dev-W7.1 (live) @ 4d7438b (working HEAD); last deployed commit was 6107a90 -- “fix(case-management): Remove auto-refresh on visibility change” (run 35, 2026-08-17 16:02:39 +0800)</w:t>
             </w:r>
           </w:p>
         </w:tc>
@@ -161,12 +282,70 @@
             <w:tcW w:w="6192" w:type="dxa"/>
           </w:tcPr>
           <w:p>
+            <w:proofErr w:type="spellStart"/>
             <w:r>
               <w:rPr>
                 <w:sz w:val="19"/>
               </w:rPr>
-              <w:t>npx jest --ci --coverage --coverageReporters=json-summary --verbose --testLocationInResults --json</w:t>
-            </w:r>
+              <w:t>npx</w:t>
+            </w:r>
+            <w:proofErr w:type="spellEnd"/>
+            <w:r>
+              <w:rPr>
+                <w:sz w:val="19"/>
+              </w:rPr>
+              <w:t xml:space="preserve"> jest --ci --coverage --</w:t>
+            </w:r>
+            <w:proofErr w:type="spellStart"/>
+            <w:r>
+              <w:rPr>
+                <w:sz w:val="19"/>
+              </w:rPr>
+              <w:t>coverageReporters</w:t>
+            </w:r>
+            <w:proofErr w:type="spellEnd"/>
+            <w:r>
+              <w:rPr>
+                <w:sz w:val="19"/>
+              </w:rPr>
+              <w:t>=</w:t>
+            </w:r>
+            <w:proofErr w:type="spellStart"/>
+            <w:r>
+              <w:rPr>
+                <w:sz w:val="19"/>
+              </w:rPr>
+              <w:t>json</w:t>
+            </w:r>
+            <w:proofErr w:type="spellEnd"/>
+            <w:r>
+              <w:rPr>
+                <w:sz w:val="19"/>
+              </w:rPr>
+              <w:t>-summary --verbose --</w:t>
+            </w:r>
+            <w:proofErr w:type="spellStart"/>
+            <w:r>
+              <w:rPr>
+                <w:sz w:val="19"/>
+              </w:rPr>
+              <w:t>testLocationInResults</w:t>
+            </w:r>
+            <w:proofErr w:type="spellEnd"/>
+            <w:r>
+              <w:rPr>
+                <w:sz w:val="19"/>
+              </w:rPr>
+              <w:t xml:space="preserve"> --</w:t>
+            </w:r>
+            <w:proofErr w:type="spellStart"/>
+            <w:r>
+              <w:rPr>
+                <w:sz w:val="19"/>
+              </w:rPr>
+              <w:t>json</w:t>
+            </w:r>
+            <w:proofErr w:type="spellEnd"/>
           </w:p>
         </w:tc>
       </w:tr>
@@ -190,10 +369,7 @@
           </w:tcPr>
           <w:p>
             <w:r>
-              <w:rPr>
-                <w:sz w:val="19"/>
-              </w:rPr>
-              <w:t>13 passed, 13 total</w:t>
+              <w:t>19 passed, 19 total</w:t>
             </w:r>
           </w:p>
         </w:tc>
@@ -218,10 +394,7 @@
           </w:tcPr>
           <w:p>
             <w:r>
-              <w:rPr>
-                <w:sz w:val="19"/>
-              </w:rPr>
-              <w:t>221 passed, 221 total</w:t>
+              <w:t>582 passed, 582 total</w:t>
             </w:r>
           </w:p>
         </w:tc>
@@ -246,9 +419,6 @@
           </w:tcPr>
           <w:p>
             <w:r>
-              <w:rPr>
-                <w:sz w:val="19"/>
-              </w:rPr>
               <w:t>0</w:t>
             </w:r>
           </w:p>
@@ -270,29 +440,151 @@
     </w:p>
     <w:p>
       <w:r>
-        <w:t>The last recorded baseline (Automated_Test_Suite_Report.docx as it existed on shafik_nyunt_2_integration) was 11 suites / 105 tests against nyunt/dev-deploy at commit 69f1d26 (20 July 2026). This branch already includes that restructuring (commit f9c9463, “refactor: Reorganize project structure and consolidate module locations”, 2026-07-19) plus substantial further feature work. Current count: 13 suites / 221 tests -- larger because two new feature suites were added on top of the 11-suite baseline:</w:t>
+        <w:t xml:space="preserve">The last recorded baseline (this same document, as it existed on dev-deploy-documentation) was 13 suites / 221 tests, from a run on 2026-08-17 while that branch had already diverged from </w:t>
+      </w:r>
+      <w:proofErr w:type="spellStart"/>
+      <w:r>
+        <w:t>nyunt</w:t>
+      </w:r>
+      <w:proofErr w:type="spellEnd"/>
+      <w:r>
+        <w:t>/dev-W7.1's actual live code. Current count, run directly against this branch's own HEAD: 19 suites / 582 tests. Two things changed: the four jaw-struct suites that baseline listed as split apart (</w:t>
+      </w:r>
+      <w:proofErr w:type="spellStart"/>
+      <w:r>
+        <w:t>jawStructLingualPlate.test.mjs</w:t>
+      </w:r>
+      <w:proofErr w:type="spellEnd"/>
+      <w:r>
+        <w:t xml:space="preserve">, </w:t>
+      </w:r>
+      <w:proofErr w:type="spellStart"/>
+      <w:r>
+        <w:t>jawStructMajorSwitch.test.mjs</w:t>
+      </w:r>
+      <w:proofErr w:type="spellEnd"/>
+      <w:r>
+        <w:t xml:space="preserve">, </w:t>
+      </w:r>
+      <w:proofErr w:type="spellStart"/>
+      <w:r>
+        <w:t>jawStructRoundTrip.test.mjs</w:t>
+      </w:r>
+      <w:proofErr w:type="spellEnd"/>
+      <w:r>
+        <w:t xml:space="preserve">, </w:t>
+      </w:r>
+      <w:proofErr w:type="spellStart"/>
+      <w:r>
+        <w:t>reciprocatingExclusivity.test.mjs</w:t>
+      </w:r>
+      <w:proofErr w:type="spellEnd"/>
+      <w:r>
+        <w:t xml:space="preserve">) do not exist on this branch -- that content lives in </w:t>
+      </w:r>
+      <w:proofErr w:type="spellStart"/>
+      <w:r>
+        <w:t>jawStruct.test.mjs</w:t>
+      </w:r>
+      <w:proofErr w:type="spellEnd"/>
+      <w:r>
+        <w:t xml:space="preserve">, </w:t>
+      </w:r>
+      <w:proofErr w:type="spellStart"/>
+      <w:r>
+        <w:t>placementRules.test.mjs</w:t>
+      </w:r>
+      <w:proofErr w:type="spellEnd"/>
+      <w:r>
+        <w:t xml:space="preserve"> and </w:t>
+      </w:r>
+      <w:proofErr w:type="spellStart"/>
+      <w:r>
+        <w:t>assemblies.test.mjs</w:t>
+      </w:r>
+      <w:proofErr w:type="spellEnd"/>
+      <w:r>
+        <w:t>, same as the pre-baseline structure -- and seven new feature suites were added on top of that:</w:t>
       </w:r>
     </w:p>
     <w:p>
       <w:pPr>
         <w:pStyle w:val="ListBullet"/>
       </w:pPr>
+      <w:proofErr w:type="spellStart"/>
       <w:r>
-        <w:t>passwordReset.test.mjs (22 tests) -- covers src/js/shared/passwordReset.js, added with the password-reset/change-password feature (commit df67de0, 2026-07-14; extracted into its own shared module in commit d38ff71, 2026-07-24).</w:t>
+        <w:lastRenderedPageBreak/>
+        <w:t>JawDesign.test.mjs</w:t>
+      </w:r>
+      <w:proofErr w:type="spellEnd"/>
+      <w:r>
+        <w:t xml:space="preserve"> (20 tests) and </w:t>
+      </w:r>
+      <w:proofErr w:type="spellStart"/>
+      <w:r>
+        <w:t>JawDesignProposal.test.mjs</w:t>
+      </w:r>
+      <w:proofErr w:type="spellEnd"/>
+      <w:r>
+        <w:t xml:space="preserve"> (57 tests) -- Kennedy classification and the DLL-backed “Load Proposed Design” feature (deploy run 34, 2026-08-17); the two most recent commits on this branch extend this same feature (jaw occlusion DLL wiring, load-proposed-design for metal/acrylic RPD).</w:t>
       </w:r>
     </w:p>
     <w:p>
       <w:pPr>
         <w:pStyle w:val="ListBullet"/>
       </w:pPr>
+      <w:proofErr w:type="spellStart"/>
       <w:r>
-        <w:lastRenderedPageBreak/>
-        <w:t>helpBot.test.mjs (94 tests) -- covers src/js/shared/helpMatcher.js and helpTopics.js, added with the AI-powered help assistant feature (commit d38ff71, 2026-07-24) and expanded twice since on this branch: FAQ/fallback-guidance coverage (commit d583fbb, 2026-07-27) and reveal-control coverage for opening containers before highlighting (commit e621194, 2026-07-28).</w:t>
+        <w:t>caseComment.test.mjs</w:t>
+      </w:r>
+      <w:proofErr w:type="spellEnd"/>
+      <w:r>
+        <w:t xml:space="preserve"> (6 tests), </w:t>
+      </w:r>
+      <w:proofErr w:type="spellStart"/>
+      <w:r>
+        <w:t>caseEmailBody.test.mjs</w:t>
+      </w:r>
+      <w:proofErr w:type="spellEnd"/>
+      <w:r>
+        <w:t xml:space="preserve"> (13 tests) and </w:t>
+      </w:r>
+      <w:proofErr w:type="spellStart"/>
+      <w:r>
+        <w:t>userSuggest.test.mjs</w:t>
+      </w:r>
+      <w:proofErr w:type="spellEnd"/>
+      <w:r>
+        <w:t xml:space="preserve"> (12 tests) -- case-comment and email/suggestion features (deploy run 33, 2026-08-14); </w:t>
+      </w:r>
+      <w:proofErr w:type="spellStart"/>
+      <w:r>
+        <w:t>imageFiles.test.mjs</w:t>
+      </w:r>
+      <w:proofErr w:type="spellEnd"/>
+      <w:r>
+        <w:t xml:space="preserve"> (19 tests, deploy run 34, 2026-08-17); and </w:t>
+      </w:r>
+      <w:proofErr w:type="spellStart"/>
+      <w:r>
+        <w:t>pageTour.test.mjs</w:t>
+      </w:r>
+      <w:proofErr w:type="spellEnd"/>
+      <w:r>
+        <w:t xml:space="preserve"> (114 tests, the single largest addition, deploy run 18, 2026-08-01 -- present before the last recorded baseline but apparently never picked up into that count).</w:t>
       </w:r>
     </w:p>
     <w:p>
       <w:r>
-        <w:t>Every suite in this run imports the real src/ module it claims to test -- confirmed by reading each file's import statements directly, not inferred from naming. No suite here is a hardcoded placeholder or hand-copied reimplementation.</w:t>
+        <w:t xml:space="preserve">Every suite in this run imports the real </w:t>
+      </w:r>
+      <w:proofErr w:type="spellStart"/>
+      <w:r>
+        <w:t>src</w:t>
+      </w:r>
+      <w:proofErr w:type="spellEnd"/>
+      <w:r>
+        <w:t>/ module it claims to test -- spot-checked by reading each new suite's import statements directly, not inferred from naming. No suite here is a hardcoded placeholder or hand-copied reimplementation.</w:t>
       </w:r>
     </w:p>
     <w:p>
@@ -310,7 +602,7 @@
         <w:tblLook w:val="04A0" w:firstRow="1" w:lastRow="0" w:firstColumn="1" w:lastColumn="0" w:noHBand="0" w:noVBand="1"/>
       </w:tblPr>
       <w:tblGrid>
-        <w:gridCol w:w="3517"/>
+        <w:gridCol w:w="3689"/>
         <w:gridCol w:w="1728"/>
         <w:gridCol w:w="1440"/>
         <w:gridCol w:w="1152"/>
@@ -380,15 +672,17 @@
       <w:tr>
         <w:tc>
           <w:tcPr>
-            <w:tcW w:w="3456" w:type="dxa"/>
+            <w:tcW w:w="3517" w:type="dxa"/>
           </w:tcPr>
           <w:p>
             <w:r>
-              <w:rPr>
-                <w:sz w:val="19"/>
-              </w:rPr>
-              <w:t>__tests__/artificialTeethDecode.test.mjs</w:t>
-            </w:r>
+              <w:t>__tests__/</w:t>
+            </w:r>
+            <w:proofErr w:type="spellStart"/>
+            <w:r>
+              <w:t>JawDesign.test.mjs</w:t>
+            </w:r>
+            <w:proofErr w:type="spellEnd"/>
           </w:p>
         </w:tc>
         <w:tc>
@@ -397,10 +691,7 @@
           </w:tcPr>
           <w:p>
             <w:r>
-              <w:rPr>
-                <w:sz w:val="19"/>
-              </w:rPr>
-              <w:t>7</w:t>
+              <w:t>3</w:t>
             </w:r>
           </w:p>
         </w:tc>
@@ -410,10 +701,7 @@
           </w:tcPr>
           <w:p>
             <w:r>
-              <w:rPr>
-                <w:sz w:val="19"/>
-              </w:rPr>
-              <w:t>28</w:t>
+              <w:t>20</w:t>
             </w:r>
           </w:p>
         </w:tc>
@@ -423,9 +711,6 @@
           </w:tcPr>
           <w:p>
             <w:r>
-              <w:rPr>
-                <w:sz w:val="19"/>
-              </w:rPr>
               <w:t>PASS</w:t>
             </w:r>
           </w:p>
@@ -434,15 +719,17 @@
       <w:tr>
         <w:tc>
           <w:tcPr>
-            <w:tcW w:w="3456" w:type="dxa"/>
+            <w:tcW w:w="3517" w:type="dxa"/>
           </w:tcPr>
           <w:p>
             <w:r>
-              <w:rPr>
-                <w:sz w:val="19"/>
-              </w:rPr>
-              <w:t>__tests__/caseEnrichment.test.mjs</w:t>
-            </w:r>
+              <w:t>__tests__/</w:t>
+            </w:r>
+            <w:proofErr w:type="spellStart"/>
+            <w:r>
+              <w:t>JawDesignProposal.test.mjs</w:t>
+            </w:r>
+            <w:proofErr w:type="spellEnd"/>
           </w:p>
         </w:tc>
         <w:tc>
@@ -451,9 +738,6 @@
           </w:tcPr>
           <w:p>
             <w:r>
-              <w:rPr>
-                <w:sz w:val="19"/>
-              </w:rPr>
               <w:t>6</w:t>
             </w:r>
           </w:p>
@@ -464,10 +748,7 @@
           </w:tcPr>
           <w:p>
             <w:r>
-              <w:rPr>
-                <w:sz w:val="19"/>
-              </w:rPr>
-              <w:t>13</w:t>
+              <w:t>57</w:t>
             </w:r>
           </w:p>
         </w:tc>
@@ -477,9 +758,6 @@
           </w:tcPr>
           <w:p>
             <w:r>
-              <w:rPr>
-                <w:sz w:val="19"/>
-              </w:rPr>
               <w:t>PASS</w:t>
             </w:r>
           </w:p>
@@ -488,15 +766,17 @@
       <w:tr>
         <w:tc>
           <w:tcPr>
-            <w:tcW w:w="3456" w:type="dxa"/>
+            <w:tcW w:w="3517" w:type="dxa"/>
           </w:tcPr>
           <w:p>
             <w:r>
-              <w:rPr>
-                <w:sz w:val="19"/>
-              </w:rPr>
-              <w:t>__tests__/clinicalInfoCodec.test.mjs</w:t>
-            </w:r>
+              <w:t>__tests__/</w:t>
+            </w:r>
+            <w:proofErr w:type="spellStart"/>
+            <w:r>
+              <w:t>artificialTeethDecode.test.mjs</w:t>
+            </w:r>
+            <w:proofErr w:type="spellEnd"/>
           </w:p>
         </w:tc>
         <w:tc>
@@ -505,10 +785,7 @@
           </w:tcPr>
           <w:p>
             <w:r>
-              <w:rPr>
-                <w:sz w:val="19"/>
-              </w:rPr>
-              <w:t>3</w:t>
+              <w:t>7</w:t>
             </w:r>
           </w:p>
         </w:tc>
@@ -518,10 +795,7 @@
           </w:tcPr>
           <w:p>
             <w:r>
-              <w:rPr>
-                <w:sz w:val="19"/>
-              </w:rPr>
-              <w:t>13</w:t>
+              <w:t>28</w:t>
             </w:r>
           </w:p>
         </w:tc>
@@ -531,9 +805,6 @@
           </w:tcPr>
           <w:p>
             <w:r>
-              <w:rPr>
-                <w:sz w:val="19"/>
-              </w:rPr>
               <w:t>PASS</w:t>
             </w:r>
           </w:p>
@@ -542,15 +813,17 @@
       <w:tr>
         <w:tc>
           <w:tcPr>
-            <w:tcW w:w="3456" w:type="dxa"/>
+            <w:tcW w:w="3517" w:type="dxa"/>
           </w:tcPr>
           <w:p>
             <w:r>
-              <w:rPr>
-                <w:sz w:val="19"/>
-              </w:rPr>
-              <w:t>__tests__/crypt.test.mjs</w:t>
-            </w:r>
+              <w:t>__tests__/</w:t>
+            </w:r>
+            <w:proofErr w:type="spellStart"/>
+            <w:r>
+              <w:t>assemblies.test.mjs</w:t>
+            </w:r>
+            <w:proofErr w:type="spellEnd"/>
           </w:p>
         </w:tc>
         <w:tc>
@@ -559,10 +832,7 @@
           </w:tcPr>
           <w:p>
             <w:r>
-              <w:rPr>
-                <w:sz w:val="19"/>
-              </w:rPr>
-              <w:t>1</w:t>
+              <w:t>18</w:t>
             </w:r>
           </w:p>
         </w:tc>
@@ -572,10 +842,7 @@
           </w:tcPr>
           <w:p>
             <w:r>
-              <w:rPr>
-                <w:sz w:val="19"/>
-              </w:rPr>
-              <w:t>3</w:t>
+              <w:t>70</w:t>
             </w:r>
           </w:p>
         </w:tc>
@@ -585,9 +852,6 @@
           </w:tcPr>
           <w:p>
             <w:r>
-              <w:rPr>
-                <w:sz w:val="19"/>
-              </w:rPr>
               <w:t>PASS</w:t>
             </w:r>
           </w:p>
@@ -596,15 +860,17 @@
       <w:tr>
         <w:tc>
           <w:tcPr>
-            <w:tcW w:w="3456" w:type="dxa"/>
+            <w:tcW w:w="3517" w:type="dxa"/>
           </w:tcPr>
           <w:p>
             <w:r>
-              <w:rPr>
-                <w:sz w:val="19"/>
-              </w:rPr>
-              <w:t>__tests__/dashboard.test.mjs</w:t>
-            </w:r>
+              <w:t>__tests__/</w:t>
+            </w:r>
+            <w:proofErr w:type="spellStart"/>
+            <w:r>
+              <w:t>caseComment.test.mjs</w:t>
+            </w:r>
+            <w:proofErr w:type="spellEnd"/>
           </w:p>
         </w:tc>
         <w:tc>
@@ -613,10 +879,7 @@
           </w:tcPr>
           <w:p>
             <w:r>
-              <w:rPr>
-                <w:sz w:val="19"/>
-              </w:rPr>
-              <w:t>4</w:t>
+              <w:t>1</w:t>
             </w:r>
           </w:p>
         </w:tc>
@@ -626,10 +889,7 @@
           </w:tcPr>
           <w:p>
             <w:r>
-              <w:rPr>
-                <w:sz w:val="19"/>
-              </w:rPr>
-              <w:t>21</w:t>
+              <w:t>6</w:t>
             </w:r>
           </w:p>
         </w:tc>
@@ -639,9 +899,6 @@
           </w:tcPr>
           <w:p>
             <w:r>
-              <w:rPr>
-                <w:sz w:val="19"/>
-              </w:rPr>
               <w:t>PASS</w:t>
             </w:r>
           </w:p>
@@ -650,15 +907,17 @@
       <w:tr>
         <w:tc>
           <w:tcPr>
-            <w:tcW w:w="3456" w:type="dxa"/>
+            <w:tcW w:w="3517" w:type="dxa"/>
           </w:tcPr>
           <w:p>
             <w:r>
-              <w:rPr>
-                <w:sz w:val="19"/>
-              </w:rPr>
-              <w:t>__tests__/helpBot.test.mjs</w:t>
-            </w:r>
+              <w:t>__tests__/</w:t>
+            </w:r>
+            <w:proofErr w:type="spellStart"/>
+            <w:r>
+              <w:t>caseEmailBody.test.mjs</w:t>
+            </w:r>
+            <w:proofErr w:type="spellEnd"/>
           </w:p>
         </w:tc>
         <w:tc>
@@ -667,10 +926,7 @@
           </w:tcPr>
           <w:p>
             <w:r>
-              <w:rPr>
-                <w:sz w:val="19"/>
-              </w:rPr>
-              <w:t>9</w:t>
+              <w:t>3</w:t>
             </w:r>
           </w:p>
         </w:tc>
@@ -680,10 +936,7 @@
           </w:tcPr>
           <w:p>
             <w:r>
-              <w:rPr>
-                <w:sz w:val="19"/>
-              </w:rPr>
-              <w:t>94</w:t>
+              <w:t>13</w:t>
             </w:r>
           </w:p>
         </w:tc>
@@ -693,9 +946,6 @@
           </w:tcPr>
           <w:p>
             <w:r>
-              <w:rPr>
-                <w:sz w:val="19"/>
-              </w:rPr>
               <w:t>PASS</w:t>
             </w:r>
           </w:p>
@@ -704,15 +954,17 @@
       <w:tr>
         <w:tc>
           <w:tcPr>
-            <w:tcW w:w="3456" w:type="dxa"/>
+            <w:tcW w:w="3517" w:type="dxa"/>
           </w:tcPr>
           <w:p>
             <w:r>
-              <w:rPr>
-                <w:sz w:val="19"/>
-              </w:rPr>
-              <w:t>__tests__/importResolution.test.mjs</w:t>
-            </w:r>
+              <w:t>__tests__/</w:t>
+            </w:r>
+            <w:proofErr w:type="spellStart"/>
+            <w:r>
+              <w:t>caseEnrichment.test.mjs</w:t>
+            </w:r>
+            <w:proofErr w:type="spellEnd"/>
           </w:p>
         </w:tc>
         <w:tc>
@@ -721,10 +973,7 @@
           </w:tcPr>
           <w:p>
             <w:r>
-              <w:rPr>
-                <w:sz w:val="19"/>
-              </w:rPr>
-              <w:t>1</w:t>
+              <w:t>8</w:t>
             </w:r>
           </w:p>
         </w:tc>
@@ -734,10 +983,7 @@
           </w:tcPr>
           <w:p>
             <w:r>
-              <w:rPr>
-                <w:sz w:val="19"/>
-              </w:rPr>
-              <w:t>3</w:t>
+              <w:t>24</w:t>
             </w:r>
           </w:p>
         </w:tc>
@@ -747,9 +993,6 @@
           </w:tcPr>
           <w:p>
             <w:r>
-              <w:rPr>
-                <w:sz w:val="19"/>
-              </w:rPr>
               <w:t>PASS</w:t>
             </w:r>
           </w:p>
@@ -758,15 +1001,17 @@
       <w:tr>
         <w:tc>
           <w:tcPr>
-            <w:tcW w:w="3456" w:type="dxa"/>
+            <w:tcW w:w="3517" w:type="dxa"/>
           </w:tcPr>
           <w:p>
             <w:r>
-              <w:rPr>
-                <w:sz w:val="19"/>
-              </w:rPr>
-              <w:t>__tests__/jawStructLingualPlate.test.mjs</w:t>
-            </w:r>
+              <w:t>__tests__/</w:t>
+            </w:r>
+            <w:proofErr w:type="spellStart"/>
+            <w:r>
+              <w:t>clinicalInfoCodec.test.mjs</w:t>
+            </w:r>
+            <w:proofErr w:type="spellEnd"/>
           </w:p>
         </w:tc>
         <w:tc>
@@ -775,10 +1020,7 @@
           </w:tcPr>
           <w:p>
             <w:r>
-              <w:rPr>
-                <w:sz w:val="19"/>
-              </w:rPr>
-              <w:t>1</w:t>
+              <w:t>3</w:t>
             </w:r>
           </w:p>
         </w:tc>
@@ -788,10 +1030,7 @@
           </w:tcPr>
           <w:p>
             <w:r>
-              <w:rPr>
-                <w:sz w:val="19"/>
-              </w:rPr>
-              <w:t>4</w:t>
+              <w:t>13</w:t>
             </w:r>
           </w:p>
         </w:tc>
@@ -801,9 +1040,6 @@
           </w:tcPr>
           <w:p>
             <w:r>
-              <w:rPr>
-                <w:sz w:val="19"/>
-              </w:rPr>
               <w:t>PASS</w:t>
             </w:r>
           </w:p>
@@ -812,15 +1048,17 @@
       <w:tr>
         <w:tc>
           <w:tcPr>
-            <w:tcW w:w="3456" w:type="dxa"/>
+            <w:tcW w:w="3517" w:type="dxa"/>
           </w:tcPr>
           <w:p>
             <w:r>
-              <w:rPr>
-                <w:sz w:val="19"/>
-              </w:rPr>
-              <w:t>__tests__/jawStructMajorSwitch.test.mjs</w:t>
-            </w:r>
+              <w:t>__tests__/</w:t>
+            </w:r>
+            <w:proofErr w:type="spellStart"/>
+            <w:r>
+              <w:t>crypt.test.mjs</w:t>
+            </w:r>
+            <w:proofErr w:type="spellEnd"/>
           </w:p>
         </w:tc>
         <w:tc>
@@ -829,9 +1067,6 @@
           </w:tcPr>
           <w:p>
             <w:r>
-              <w:rPr>
-                <w:sz w:val="19"/>
-              </w:rPr>
               <w:t>1</w:t>
             </w:r>
           </w:p>
@@ -842,10 +1077,7 @@
           </w:tcPr>
           <w:p>
             <w:r>
-              <w:rPr>
-                <w:sz w:val="19"/>
-              </w:rPr>
-              <w:t>4</w:t>
+              <w:t>3</w:t>
             </w:r>
           </w:p>
         </w:tc>
@@ -855,9 +1087,6 @@
           </w:tcPr>
           <w:p>
             <w:r>
-              <w:rPr>
-                <w:sz w:val="19"/>
-              </w:rPr>
               <w:t>PASS</w:t>
             </w:r>
           </w:p>
@@ -866,15 +1095,17 @@
       <w:tr>
         <w:tc>
           <w:tcPr>
-            <w:tcW w:w="3456" w:type="dxa"/>
+            <w:tcW w:w="3517" w:type="dxa"/>
           </w:tcPr>
           <w:p>
             <w:r>
-              <w:rPr>
-                <w:sz w:val="19"/>
-              </w:rPr>
-              <w:t>__tests__/jawStructRoundTrip.test.mjs</w:t>
-            </w:r>
+              <w:t>__tests__/</w:t>
+            </w:r>
+            <w:proofErr w:type="spellStart"/>
+            <w:r>
+              <w:t>dashboard.test.mjs</w:t>
+            </w:r>
+            <w:proofErr w:type="spellEnd"/>
           </w:p>
         </w:tc>
         <w:tc>
@@ -883,10 +1114,7 @@
           </w:tcPr>
           <w:p>
             <w:r>
-              <w:rPr>
-                <w:sz w:val="19"/>
-              </w:rPr>
-              <w:t>1</w:t>
+              <w:t>4</w:t>
             </w:r>
           </w:p>
         </w:tc>
@@ -896,10 +1124,7 @@
           </w:tcPr>
           <w:p>
             <w:r>
-              <w:rPr>
-                <w:sz w:val="19"/>
-              </w:rPr>
-              <w:t>2</w:t>
+              <w:t>19</w:t>
             </w:r>
           </w:p>
         </w:tc>
@@ -909,9 +1134,6 @@
           </w:tcPr>
           <w:p>
             <w:r>
-              <w:rPr>
-                <w:sz w:val="19"/>
-              </w:rPr>
               <w:t>PASS</w:t>
             </w:r>
           </w:p>
@@ -920,15 +1142,17 @@
       <w:tr>
         <w:tc>
           <w:tcPr>
-            <w:tcW w:w="3456" w:type="dxa"/>
+            <w:tcW w:w="3517" w:type="dxa"/>
           </w:tcPr>
           <w:p>
             <w:r>
-              <w:rPr>
-                <w:sz w:val="19"/>
-              </w:rPr>
-              <w:t>__tests__/mergeInstructions.test.mjs</w:t>
-            </w:r>
+              <w:t>__tests__/</w:t>
+            </w:r>
+            <w:proofErr w:type="spellStart"/>
+            <w:r>
+              <w:t>helpBot.test.mjs</w:t>
+            </w:r>
+            <w:proofErr w:type="spellEnd"/>
           </w:p>
         </w:tc>
         <w:tc>
@@ -937,10 +1161,7 @@
           </w:tcPr>
           <w:p>
             <w:r>
-              <w:rPr>
-                <w:sz w:val="19"/>
-              </w:rPr>
-              <w:t>1</w:t>
+              <w:t>9</w:t>
             </w:r>
           </w:p>
         </w:tc>
@@ -950,10 +1171,7 @@
           </w:tcPr>
           <w:p>
             <w:r>
-              <w:rPr>
-                <w:sz w:val="19"/>
-              </w:rPr>
-              <w:t>5</w:t>
+              <w:t>87</w:t>
             </w:r>
           </w:p>
         </w:tc>
@@ -963,9 +1181,6 @@
           </w:tcPr>
           <w:p>
             <w:r>
-              <w:rPr>
-                <w:sz w:val="19"/>
-              </w:rPr>
               <w:t>PASS</w:t>
             </w:r>
           </w:p>
@@ -974,15 +1189,17 @@
       <w:tr>
         <w:tc>
           <w:tcPr>
-            <w:tcW w:w="3456" w:type="dxa"/>
+            <w:tcW w:w="3517" w:type="dxa"/>
           </w:tcPr>
           <w:p>
             <w:r>
-              <w:rPr>
-                <w:sz w:val="19"/>
-              </w:rPr>
-              <w:t>__tests__/passwordReset.test.mjs</w:t>
-            </w:r>
+              <w:t>__tests__/</w:t>
+            </w:r>
+            <w:proofErr w:type="spellStart"/>
+            <w:r>
+              <w:t>imageFiles.test.mjs</w:t>
+            </w:r>
+            <w:proofErr w:type="spellEnd"/>
           </w:p>
         </w:tc>
         <w:tc>
@@ -991,9 +1208,6 @@
           </w:tcPr>
           <w:p>
             <w:r>
-              <w:rPr>
-                <w:sz w:val="19"/>
-              </w:rPr>
               <w:t>4</w:t>
             </w:r>
           </w:p>
@@ -1004,10 +1218,7 @@
           </w:tcPr>
           <w:p>
             <w:r>
-              <w:rPr>
-                <w:sz w:val="19"/>
-              </w:rPr>
-              <w:t>22</w:t>
+              <w:t>19</w:t>
             </w:r>
           </w:p>
         </w:tc>
@@ -1017,9 +1228,6 @@
           </w:tcPr>
           <w:p>
             <w:r>
-              <w:rPr>
-                <w:sz w:val="19"/>
-              </w:rPr>
               <w:t>PASS</w:t>
             </w:r>
           </w:p>
@@ -1028,15 +1236,17 @@
       <w:tr>
         <w:tc>
           <w:tcPr>
-            <w:tcW w:w="3456" w:type="dxa"/>
+            <w:tcW w:w="3517" w:type="dxa"/>
           </w:tcPr>
           <w:p>
             <w:r>
-              <w:rPr>
-                <w:sz w:val="19"/>
-              </w:rPr>
-              <w:t>__tests__/reciprocatingExclusivity.test.mjs</w:t>
-            </w:r>
+              <w:t>__tests__/</w:t>
+            </w:r>
+            <w:proofErr w:type="spellStart"/>
+            <w:r>
+              <w:t>importResolution.test.mjs</w:t>
+            </w:r>
+            <w:proofErr w:type="spellEnd"/>
           </w:p>
         </w:tc>
         <w:tc>
@@ -1045,10 +1255,7 @@
           </w:tcPr>
           <w:p>
             <w:r>
-              <w:rPr>
-                <w:sz w:val="19"/>
-              </w:rPr>
-              <w:t>2</w:t>
+              <w:t>1</w:t>
             </w:r>
           </w:p>
         </w:tc>
@@ -1058,10 +1265,7 @@
           </w:tcPr>
           <w:p>
             <w:r>
-              <w:rPr>
-                <w:sz w:val="19"/>
-              </w:rPr>
-              <w:t>9</w:t>
+              <w:t>3</w:t>
             </w:r>
           </w:p>
         </w:tc>
@@ -1071,9 +1275,288 @@
           </w:tcPr>
           <w:p>
             <w:r>
-              <w:rPr>
-                <w:sz w:val="19"/>
-              </w:rPr>
+              <w:t>PASS</w:t>
+            </w:r>
+          </w:p>
+        </w:tc>
+      </w:tr>
+      <w:tr>
+        <w:tc>
+          <w:tcPr>
+            <w:tcW w:w="3517" w:type="dxa"/>
+          </w:tcPr>
+          <w:p>
+            <w:r>
+              <w:t>__tests__/</w:t>
+            </w:r>
+            <w:proofErr w:type="spellStart"/>
+            <w:r>
+              <w:t>jawStruct.test.mjs</w:t>
+            </w:r>
+            <w:proofErr w:type="spellEnd"/>
+          </w:p>
+        </w:tc>
+        <w:tc>
+          <w:tcPr>
+            <w:tcW w:w="1728" w:type="dxa"/>
+          </w:tcPr>
+          <w:p>
+            <w:r>
+              <w:t>6</w:t>
+            </w:r>
+          </w:p>
+        </w:tc>
+        <w:tc>
+          <w:tcPr>
+            <w:tcW w:w="1440" w:type="dxa"/>
+          </w:tcPr>
+          <w:p>
+            <w:r>
+              <w:t>15</w:t>
+            </w:r>
+          </w:p>
+        </w:tc>
+        <w:tc>
+          <w:tcPr>
+            <w:tcW w:w="1152" w:type="dxa"/>
+          </w:tcPr>
+          <w:p>
+            <w:r>
+              <w:t>PASS</w:t>
+            </w:r>
+          </w:p>
+        </w:tc>
+      </w:tr>
+      <w:tr>
+        <w:tc>
+          <w:tcPr>
+            <w:tcW w:w="3517" w:type="dxa"/>
+          </w:tcPr>
+          <w:p>
+            <w:r>
+              <w:t>__tests__/</w:t>
+            </w:r>
+            <w:proofErr w:type="spellStart"/>
+            <w:r>
+              <w:t>mergeInstructions.test.mjs</w:t>
+            </w:r>
+            <w:proofErr w:type="spellEnd"/>
+          </w:p>
+        </w:tc>
+        <w:tc>
+          <w:tcPr>
+            <w:tcW w:w="1728" w:type="dxa"/>
+          </w:tcPr>
+          <w:p>
+            <w:r>
+              <w:t>1</w:t>
+            </w:r>
+          </w:p>
+        </w:tc>
+        <w:tc>
+          <w:tcPr>
+            <w:tcW w:w="1440" w:type="dxa"/>
+          </w:tcPr>
+          <w:p>
+            <w:r>
+              <w:t>5</w:t>
+            </w:r>
+          </w:p>
+        </w:tc>
+        <w:tc>
+          <w:tcPr>
+            <w:tcW w:w="1152" w:type="dxa"/>
+          </w:tcPr>
+          <w:p>
+            <w:r>
+              <w:t>PASS</w:t>
+            </w:r>
+          </w:p>
+        </w:tc>
+      </w:tr>
+      <w:tr>
+        <w:tc>
+          <w:tcPr>
+            <w:tcW w:w="3517" w:type="dxa"/>
+          </w:tcPr>
+          <w:p>
+            <w:r>
+              <w:t>__tests__/</w:t>
+            </w:r>
+            <w:proofErr w:type="spellStart"/>
+            <w:r>
+              <w:t>pageTour.test.mjs</w:t>
+            </w:r>
+            <w:proofErr w:type="spellEnd"/>
+          </w:p>
+        </w:tc>
+        <w:tc>
+          <w:tcPr>
+            <w:tcW w:w="1728" w:type="dxa"/>
+          </w:tcPr>
+          <w:p>
+            <w:r>
+              <w:t>12</w:t>
+            </w:r>
+          </w:p>
+        </w:tc>
+        <w:tc>
+          <w:tcPr>
+            <w:tcW w:w="1440" w:type="dxa"/>
+          </w:tcPr>
+          <w:p>
+            <w:r>
+              <w:t>114</w:t>
+            </w:r>
+          </w:p>
+        </w:tc>
+        <w:tc>
+          <w:tcPr>
+            <w:tcW w:w="1152" w:type="dxa"/>
+          </w:tcPr>
+          <w:p>
+            <w:r>
+              <w:t>PASS</w:t>
+            </w:r>
+          </w:p>
+        </w:tc>
+      </w:tr>
+      <w:tr>
+        <w:tc>
+          <w:tcPr>
+            <w:tcW w:w="3517" w:type="dxa"/>
+          </w:tcPr>
+          <w:p>
+            <w:r>
+              <w:t>__tests__/</w:t>
+            </w:r>
+            <w:proofErr w:type="spellStart"/>
+            <w:r>
+              <w:t>passwordReset.test.mjs</w:t>
+            </w:r>
+            <w:proofErr w:type="spellEnd"/>
+          </w:p>
+        </w:tc>
+        <w:tc>
+          <w:tcPr>
+            <w:tcW w:w="1728" w:type="dxa"/>
+          </w:tcPr>
+          <w:p>
+            <w:r>
+              <w:t>4</w:t>
+            </w:r>
+          </w:p>
+        </w:tc>
+        <w:tc>
+          <w:tcPr>
+            <w:tcW w:w="1440" w:type="dxa"/>
+          </w:tcPr>
+          <w:p>
+            <w:r>
+              <w:t>22</w:t>
+            </w:r>
+          </w:p>
+        </w:tc>
+        <w:tc>
+          <w:tcPr>
+            <w:tcW w:w="1152" w:type="dxa"/>
+          </w:tcPr>
+          <w:p>
+            <w:r>
+              <w:t>PASS</w:t>
+            </w:r>
+          </w:p>
+        </w:tc>
+      </w:tr>
+      <w:tr>
+        <w:tc>
+          <w:tcPr>
+            <w:tcW w:w="3517" w:type="dxa"/>
+          </w:tcPr>
+          <w:p>
+            <w:r>
+              <w:t>__tests__/</w:t>
+            </w:r>
+            <w:proofErr w:type="spellStart"/>
+            <w:r>
+              <w:t>placementRules.test.mjs</w:t>
+            </w:r>
+            <w:proofErr w:type="spellEnd"/>
+          </w:p>
+        </w:tc>
+        <w:tc>
+          <w:tcPr>
+            <w:tcW w:w="1728" w:type="dxa"/>
+          </w:tcPr>
+          <w:p>
+            <w:r>
+              <w:t>7</w:t>
+            </w:r>
+          </w:p>
+        </w:tc>
+        <w:tc>
+          <w:tcPr>
+            <w:tcW w:w="1440" w:type="dxa"/>
+          </w:tcPr>
+          <w:p>
+            <w:r>
+              <w:t>52</w:t>
+            </w:r>
+          </w:p>
+        </w:tc>
+        <w:tc>
+          <w:tcPr>
+            <w:tcW w:w="1152" w:type="dxa"/>
+          </w:tcPr>
+          <w:p>
+            <w:r>
+              <w:t>PASS</w:t>
+            </w:r>
+          </w:p>
+        </w:tc>
+      </w:tr>
+      <w:tr>
+        <w:tc>
+          <w:tcPr>
+            <w:tcW w:w="3517" w:type="dxa"/>
+          </w:tcPr>
+          <w:p>
+            <w:r>
+              <w:t>__tests__/</w:t>
+            </w:r>
+            <w:proofErr w:type="spellStart"/>
+            <w:r>
+              <w:t>userSuggest.test.mjs</w:t>
+            </w:r>
+            <w:proofErr w:type="spellEnd"/>
+          </w:p>
+        </w:tc>
+        <w:tc>
+          <w:tcPr>
+            <w:tcW w:w="1728" w:type="dxa"/>
+          </w:tcPr>
+          <w:p>
+            <w:r>
+              <w:t>3</w:t>
+            </w:r>
+          </w:p>
+        </w:tc>
+        <w:tc>
+          <w:tcPr>
+            <w:tcW w:w="1440" w:type="dxa"/>
+          </w:tcPr>
+          <w:p>
+            <w:r>
+              <w:t>12</w:t>
+            </w:r>
+          </w:p>
+        </w:tc>
+        <w:tc>
+          <w:tcPr>
+            <w:tcW w:w="1152" w:type="dxa"/>
+          </w:tcPr>
+          <w:p>
+            <w:r>
               <w:t>PASS</w:t>
             </w:r>
           </w:p>
@@ -1088,14 +1571,8 @@
     <w:p>
       <w:pPr>
         <w:pStyle w:val="Heading1"/>
-        <w:rPr>
-          <w:highlight w:val="yellow"/>
-        </w:rPr>
       </w:pPr>
       <w:r>
-        <w:rPr>
-          <w:highlight w:val="yellow"/>
-        </w:rPr>
         <w:t>6. Coverage Summary</w:t>
       </w:r>
     </w:p>
@@ -1117,16 +1594,10 @@
             <w:shd w:val="clear" w:color="auto" w:fill="D9D9D9"/>
           </w:tcPr>
           <w:p>
-            <w:pPr>
-              <w:rPr>
-                <w:highlight w:val="yellow"/>
-              </w:rPr>
-            </w:pPr>
             <w:r>
               <w:rPr>
                 <w:b/>
                 <w:sz w:val="19"/>
-                <w:highlight w:val="yellow"/>
               </w:rPr>
               <w:t>Metric</w:t>
             </w:r>
@@ -1138,16 +1609,10 @@
             <w:shd w:val="clear" w:color="auto" w:fill="D9D9D9"/>
           </w:tcPr>
           <w:p>
-            <w:pPr>
-              <w:rPr>
-                <w:highlight w:val="yellow"/>
-              </w:rPr>
-            </w:pPr>
             <w:r>
               <w:rPr>
                 <w:b/>
                 <w:sz w:val="19"/>
-                <w:highlight w:val="yellow"/>
               </w:rPr>
               <w:t>Covered / Total</w:t>
             </w:r>
@@ -1159,16 +1624,10 @@
             <w:shd w:val="clear" w:color="auto" w:fill="D9D9D9"/>
           </w:tcPr>
           <w:p>
-            <w:pPr>
-              <w:rPr>
-                <w:highlight w:val="yellow"/>
-              </w:rPr>
-            </w:pPr>
             <w:r>
               <w:rPr>
                 <w:b/>
                 <w:sz w:val="19"/>
-                <w:highlight w:val="yellow"/>
               </w:rPr>
               <w:t>%</w:t>
             </w:r>
@@ -1181,15 +1640,9 @@
             <w:tcW w:w="2592" w:type="dxa"/>
           </w:tcPr>
           <w:p>
-            <w:pPr>
-              <w:rPr>
-                <w:highlight w:val="yellow"/>
-              </w:rPr>
-            </w:pPr>
             <w:r>
               <w:rPr>
                 <w:sz w:val="19"/>
-                <w:highlight w:val="yellow"/>
               </w:rPr>
               <w:t>Statements</w:t>
             </w:r>
@@ -1200,17 +1653,8 @@
             <w:tcW w:w="3168" w:type="dxa"/>
           </w:tcPr>
           <w:p>
-            <w:pPr>
-              <w:rPr>
-                <w:highlight w:val="yellow"/>
-              </w:rPr>
-            </w:pPr>
-            <w:r>
-              <w:rPr>
-                <w:sz w:val="19"/>
-                <w:highlight w:val="yellow"/>
-              </w:rPr>
-              <w:t>1384/5310</w:t>
+            <w:r>
+              <w:t>2923/14531</w:t>
             </w:r>
           </w:p>
         </w:tc>
@@ -1219,17 +1663,8 @@
             <w:tcW w:w="1440" w:type="dxa"/>
           </w:tcPr>
           <w:p>
-            <w:pPr>
-              <w:rPr>
-                <w:highlight w:val="yellow"/>
-              </w:rPr>
-            </w:pPr>
-            <w:r>
-              <w:rPr>
-                <w:sz w:val="19"/>
-                <w:highlight w:val="yellow"/>
-              </w:rPr>
-              <w:t>26.06</w:t>
+            <w:r>
+              <w:t>20.11</w:t>
             </w:r>
           </w:p>
         </w:tc>
@@ -1240,15 +1675,9 @@
             <w:tcW w:w="2592" w:type="dxa"/>
           </w:tcPr>
           <w:p>
-            <w:pPr>
-              <w:rPr>
-                <w:highlight w:val="yellow"/>
-              </w:rPr>
-            </w:pPr>
             <w:r>
               <w:rPr>
                 <w:sz w:val="19"/>
-                <w:highlight w:val="yellow"/>
               </w:rPr>
               <w:t>Branches</w:t>
             </w:r>
@@ -1259,17 +1688,8 @@
             <w:tcW w:w="3168" w:type="dxa"/>
           </w:tcPr>
           <w:p>
-            <w:pPr>
-              <w:rPr>
-                <w:highlight w:val="yellow"/>
-              </w:rPr>
-            </w:pPr>
-            <w:r>
-              <w:rPr>
-                <w:sz w:val="19"/>
-                <w:highlight w:val="yellow"/>
-              </w:rPr>
-              <w:t>862/4381</w:t>
+            <w:r>
+              <w:t>1823/9345</w:t>
             </w:r>
           </w:p>
         </w:tc>
@@ -1278,17 +1698,8 @@
             <w:tcW w:w="1440" w:type="dxa"/>
           </w:tcPr>
           <w:p>
-            <w:pPr>
-              <w:rPr>
-                <w:highlight w:val="yellow"/>
-              </w:rPr>
-            </w:pPr>
-            <w:r>
-              <w:rPr>
-                <w:sz w:val="19"/>
-                <w:highlight w:val="yellow"/>
-              </w:rPr>
-              <w:t>19.67</w:t>
+            <w:r>
+              <w:t>19.5</w:t>
             </w:r>
           </w:p>
         </w:tc>
@@ -1299,15 +1710,9 @@
             <w:tcW w:w="2592" w:type="dxa"/>
           </w:tcPr>
           <w:p>
-            <w:pPr>
-              <w:rPr>
-                <w:highlight w:val="yellow"/>
-              </w:rPr>
-            </w:pPr>
             <w:r>
               <w:rPr>
                 <w:sz w:val="19"/>
-                <w:highlight w:val="yellow"/>
               </w:rPr>
               <w:t>Functions</w:t>
             </w:r>
@@ -1318,17 +1723,8 @@
             <w:tcW w:w="3168" w:type="dxa"/>
           </w:tcPr>
           <w:p>
-            <w:pPr>
-              <w:rPr>
-                <w:highlight w:val="yellow"/>
-              </w:rPr>
-            </w:pPr>
-            <w:r>
-              <w:rPr>
-                <w:sz w:val="19"/>
-                <w:highlight w:val="yellow"/>
-              </w:rPr>
-              <w:t>209/888</w:t>
+            <w:r>
+              <w:t>503/2104</w:t>
             </w:r>
           </w:p>
         </w:tc>
@@ -1337,17 +1733,8 @@
             <w:tcW w:w="1440" w:type="dxa"/>
           </w:tcPr>
           <w:p>
-            <w:pPr>
-              <w:rPr>
-                <w:highlight w:val="yellow"/>
-              </w:rPr>
-            </w:pPr>
-            <w:r>
-              <w:rPr>
-                <w:sz w:val="19"/>
-                <w:highlight w:val="yellow"/>
-              </w:rPr>
-              <w:t>23.53</w:t>
+            <w:r>
+              <w:t>23.9</w:t>
             </w:r>
           </w:p>
         </w:tc>
@@ -1358,15 +1745,9 @@
             <w:tcW w:w="2592" w:type="dxa"/>
           </w:tcPr>
           <w:p>
-            <w:pPr>
-              <w:rPr>
-                <w:highlight w:val="yellow"/>
-              </w:rPr>
-            </w:pPr>
             <w:r>
               <w:rPr>
                 <w:sz w:val="19"/>
-                <w:highlight w:val="yellow"/>
               </w:rPr>
               <w:t>Lines</w:t>
             </w:r>
@@ -1377,17 +1758,8 @@
             <w:tcW w:w="3168" w:type="dxa"/>
           </w:tcPr>
           <w:p>
-            <w:pPr>
-              <w:rPr>
-                <w:highlight w:val="yellow"/>
-              </w:rPr>
-            </w:pPr>
-            <w:r>
-              <w:rPr>
-                <w:sz w:val="19"/>
-                <w:highlight w:val="yellow"/>
-              </w:rPr>
-              <w:t>1226/4630</w:t>
+            <w:r>
+              <w:t>2592/12734</w:t>
             </w:r>
           </w:p>
         </w:tc>
@@ -1396,17 +1768,8 @@
             <w:tcW w:w="1440" w:type="dxa"/>
           </w:tcPr>
           <w:p>
-            <w:pPr>
-              <w:rPr>
-                <w:highlight w:val="yellow"/>
-              </w:rPr>
-            </w:pPr>
-            <w:r>
-              <w:rPr>
-                <w:sz w:val="19"/>
-                <w:highlight w:val="yellow"/>
-              </w:rPr>
-              <w:t>26.47</w:t>
+            <w:r>
+              <w:t>20.35</w:t>
             </w:r>
           </w:p>
         </w:tc>
@@ -1415,17 +1778,52 @@
     <w:p>
       <w:pPr>
         <w:spacing w:after="80"/>
-        <w:rPr>
-          <w:highlight w:val="yellow"/>
-        </w:rPr>
       </w:pPr>
     </w:p>
     <w:p>
       <w:r>
-        <w:rPr>
-          <w:highlight w:val="yellow"/>
-        </w:rPr>
-        <w:t>Coverage is only collected for modules touched transitively by the current suites -- most UI wiring, page controllers and much of the 3D viewer runtime have no automated coverage. Full per-file detail is in Documentations/AutoTest Results/automated-test-run.json (coverageByFile) and coverage/coverage-summary.json (regenerated locally each run, gitignored).</w:t>
+        <w:lastRenderedPageBreak/>
+        <w:t>Coverage is only collected for modules touched transitively by the current suites -- most UI wiring, page controllers and much of the 3D viewer runtime have no automated coverage. Full per-file detail is in Documentations/</w:t>
+      </w:r>
+      <w:proofErr w:type="spellStart"/>
+      <w:r>
+        <w:t>AutoTest</w:t>
+      </w:r>
+      <w:proofErr w:type="spellEnd"/>
+      <w:r>
+        <w:t xml:space="preserve"> Results/automated-test-</w:t>
+      </w:r>
+      <w:proofErr w:type="spellStart"/>
+      <w:r>
+        <w:t>run.json</w:t>
+      </w:r>
+      <w:proofErr w:type="spellEnd"/>
+      <w:r>
+        <w:t xml:space="preserve"> (</w:t>
+      </w:r>
+      <w:proofErr w:type="spellStart"/>
+      <w:r>
+        <w:t>coverageByFile</w:t>
+      </w:r>
+      <w:proofErr w:type="spellEnd"/>
+      <w:r>
+        <w:t>) and coverage/coverage-</w:t>
+      </w:r>
+      <w:proofErr w:type="spellStart"/>
+      <w:r>
+        <w:t>summary.json</w:t>
+      </w:r>
+      <w:proofErr w:type="spellEnd"/>
+      <w:r>
+        <w:t xml:space="preserve"> (regenerated locally each run, </w:t>
+      </w:r>
+      <w:proofErr w:type="spellStart"/>
+      <w:r>
+        <w:t>gitignored</w:t>
+      </w:r>
+      <w:proofErr w:type="spellEnd"/>
+      <w:r>
+        <w:t>).</w:t>
       </w:r>
     </w:p>
     <w:p>
@@ -1438,9 +1836,8 @@
     </w:p>
     <w:p>
       <w:r>
-        <w:t>The following UAT workflows currently rely entirely on manual UAT execution with no automated regression backstop: UAT-03 Case Creation, UAT-05 Collaboration (Chat/Notifications), UAT-09 Add STL Files, UAT-10 Version History, UAT-11 Download / Export / Share, UAT-12 Responsive (Tablet + Mobile). helpBot.test.mjs (94 tests) also has no standing UAT-xx case to attach to -- see UAT_Report.docx §2.6 for the full breakdown.</w:t>
+        <w:t>The following UAT workflows currently rely entirely on manual UAT execution with no automated regression backstop: UAT-03 Case Creation, UAT-05 Collaboration (Chat/Notifications), UAT-09 Add STL Files, UAT-10 Version History, UAT-11 Download / Export / Share, UAT-12 Responsive (Tablet + Mobile). helpBot.test.mjs (87 tests) also has no standing UAT-xx case to attach to -- see UAT_Report.docx §2.6 for the full breakdown.</w:t>
       </w:r>
-      <w:r/>
     </w:p>
     <w:p>
       <w:pPr>
@@ -1457,8 +1854,8 @@
         <w:tblLook w:val="04A0" w:firstRow="1" w:lastRow="0" w:firstColumn="1" w:lastColumn="0" w:noHBand="0" w:noVBand="1"/>
       </w:tblPr>
       <w:tblGrid>
-        <w:gridCol w:w="2425"/>
-        <w:gridCol w:w="6431"/>
+        <w:gridCol w:w="2484"/>
+        <w:gridCol w:w="6372"/>
       </w:tblGrid>
       <w:tr>
         <w:tc>
@@ -1539,11 +1936,19 @@
             <w:tcW w:w="6768" w:type="dxa"/>
           </w:tcPr>
           <w:p>
+            <w:proofErr w:type="spellStart"/>
             <w:r>
               <w:rPr>
                 <w:sz w:val="19"/>
               </w:rPr>
-              <w:t>SmartRPD Web Application</w:t>
+              <w:t>SmartRPD</w:t>
+            </w:r>
+            <w:proofErr w:type="spellEnd"/>
+            <w:r>
+              <w:rPr>
+                <w:sz w:val="19"/>
+              </w:rPr>
+              <w:t xml:space="preserve"> Web Application</w:t>
             </w:r>
           </w:p>
         </w:tc>
@@ -1567,11 +1972,13 @@
             <w:tcW w:w="6768" w:type="dxa"/>
           </w:tcPr>
           <w:p>
-            <w:r>
-              <w:rPr>
-                <w:sz w:val="19"/>
-              </w:rPr>
-              <w:t>nyunt/dev-W7.1 (live) — source: dev-deploy-documentation</w:t>
+            <w:proofErr w:type="spellStart"/>
+            <w:r>
+              <w:t>nyunt</w:t>
+            </w:r>
+            <w:proofErr w:type="spellEnd"/>
+            <w:r>
+              <w:t>/dev-W7.1 (live) -- Documentations/ now maintained directly on this branch</w:t>
             </w:r>
           </w:p>
         </w:tc>
@@ -1596,10 +2003,13 @@
           </w:tcPr>
           <w:p>
             <w:r>
-              <w:rPr>
-                <w:sz w:val="19"/>
-              </w:rPr>
-              <w:t>31 July 2026</w:t>
+              <w:t>2</w:t>
+            </w:r>
+            <w:r>
+              <w:t xml:space="preserve">1 </w:t>
+            </w:r>
+            <w:r>
+              <w:t>August 2026</w:t>
             </w:r>
           </w:p>
         </w:tc>

</xml_diff>